<commit_message>
Cải thiện logic gia hạn + cập nhật PL 01
</commit_message>
<xml_diff>
--- a/contracts/HỢP ĐỒNG 2/PL 01 Hợp đồng mẫu 2.docx
+++ b/contracts/HỢP ĐỒNG 2/PL 01 Hợp đồng mẫu 2.docx
@@ -760,7 +760,43 @@
           <w:szCs w:val="24"/>
           <w:lang w:val="it-IT"/>
         </w:rPr>
-        <w:t>thống nhất gia hạn Hợp đồng hợp tác 2 đến ngày 30/6/2025.</w:t>
+        <w:t>thống nhất gia hạn Hợp đồng hợp tác 2</w:t>
+      </w:r>
+      <w:r>
+        <w:rPr>
+          <w:rFonts w:ascii="Times New Roman" w:hAnsi="Times New Roman" w:cs="Times New Roman"/>
+          <w:sz w:val="24"/>
+          <w:szCs w:val="24"/>
+          <w:lang w:val="it-IT"/>
+        </w:rPr>
+        <w:t xml:space="preserve"> này</w:t>
+      </w:r>
+      <w:r>
+        <w:rPr>
+          <w:rFonts w:ascii="Times New Roman" w:hAnsi="Times New Roman" w:cs="Times New Roman"/>
+          <w:sz w:val="24"/>
+          <w:szCs w:val="24"/>
+          <w:lang w:val="it-IT"/>
+        </w:rPr>
+        <w:t xml:space="preserve"> đến ngày 30/6/202</w:t>
+      </w:r>
+      <w:r>
+        <w:rPr>
+          <w:rFonts w:ascii="Times New Roman" w:hAnsi="Times New Roman" w:cs="Times New Roman"/>
+          <w:sz w:val="24"/>
+          <w:szCs w:val="24"/>
+          <w:lang w:val="it-IT"/>
+        </w:rPr>
+        <w:t>7</w:t>
+      </w:r>
+      <w:r>
+        <w:rPr>
+          <w:rFonts w:ascii="Times New Roman" w:hAnsi="Times New Roman" w:cs="Times New Roman"/>
+          <w:sz w:val="24"/>
+          <w:szCs w:val="24"/>
+          <w:lang w:val="it-IT"/>
+        </w:rPr>
+        <w:t>.</w:t>
       </w:r>
     </w:p>
     <w:p>

</xml_diff>